<commit_message>
feat(palestras): ajusta a aula da Copel para 08h–11h e para o Gemini
Reduz o encontro de 09/10/2026 a três horas, das 08h às 11h, com
intervalo de quinze minutos; os trinta e cinco minutos retirados saem das
práticas, da devolutiva e da demonstração, e os cronômetros acompanham.
O MVP Zero passa a ser construído no Gemini, com a instrução salva como
skill e o conhecimento em um notebook do Gemini Notebook, e um Gem como
alternativa enquanto as skills não forem liberadas na conta. O zip do kit
sai do acervo, e os arquivos ficam acessíveis pelos links de cada prática
e da seção 12 do material.

Co-Authored-By: Claude Opus 5.5 (1M context) <noreply@anthropic.com>
</commit_message>
<xml_diff>
--- a/pages/palestras/assets/copel/kit-ia-na-pratica/documento-do-grupo.docx
+++ b/pages/palestras/assets/copel/kit-ia-na-pratica/documento-do-grupo.docx
@@ -171,7 +171,7 @@
       </w:pPr>
       <w:r>
         <w:rPr/>
-        <w:t>Qual ferramenta autorizada será usada (Copilot, Gemini, ChatGPT ou outra):</w:t>
+        <w:t>Ferramenta: Gemini, na conta corporativa da Copel. Recurso usado (skill, Gem ou conversa comum):</w:t>
       </w:r>
     </w:p>
     <w:p>
@@ -324,7 +324,7 @@
       </w:pPr>
       <w:r>
         <w:rPr/>
-        <w:t>Esses documentos podem ser anexados? São públicos, internos ou restritos?</w:t>
+        <w:t>Esses documentos podem entrar como fontes de um notebook? São públicos, internos ou restritos?</w:t>
       </w:r>
     </w:p>
     <w:p>
@@ -539,7 +539,7 @@
     </w:p>
     <w:tbl>
       <w:tblPr>
-        <w:tblW w:w="330" w:type="dxa"/>
+        <w:tblW w:w="315" w:type="dxa"/>
         <w:jc w:val="left"/>
         <w:tblInd w:w="-7" w:type="dxa"/>
         <w:tblLayout w:type="fixed"/>
@@ -551,13 +551,13 @@
         </w:tblCellMar>
       </w:tblPr>
       <w:tblGrid>
-        <w:gridCol w:w="330"/>
+        <w:gridCol w:w="315"/>
       </w:tblGrid>
       <w:tr>
         <w:trPr/>
         <w:tc>
           <w:tcPr>
-            <w:tcW w:w="330" w:type="dxa"/>
+            <w:tcW w:w="315" w:type="dxa"/>
             <w:tcBorders>
               <w:top w:val="double" w:sz="2" w:space="0" w:color="808080"/>
               <w:left w:val="double" w:sz="2" w:space="0" w:color="808080"/>
@@ -617,7 +617,7 @@
     </w:p>
     <w:tbl>
       <w:tblPr>
-        <w:tblW w:w="330" w:type="dxa"/>
+        <w:tblW w:w="315" w:type="dxa"/>
         <w:jc w:val="left"/>
         <w:tblInd w:w="-7" w:type="dxa"/>
         <w:tblLayout w:type="fixed"/>
@@ -629,13 +629,13 @@
         </w:tblCellMar>
       </w:tblPr>
       <w:tblGrid>
-        <w:gridCol w:w="330"/>
+        <w:gridCol w:w="315"/>
       </w:tblGrid>
       <w:tr>
         <w:trPr/>
         <w:tc>
           <w:tcPr>
-            <w:tcW w:w="330" w:type="dxa"/>
+            <w:tcW w:w="315" w:type="dxa"/>
             <w:tcBorders>
               <w:top w:val="double" w:sz="2" w:space="0" w:color="808080"/>
               <w:left w:val="double" w:sz="2" w:space="0" w:color="808080"/>
@@ -695,7 +695,7 @@
     </w:p>
     <w:tbl>
       <w:tblPr>
-        <w:tblW w:w="6845" w:type="dxa"/>
+        <w:tblW w:w="6020" w:type="dxa"/>
         <w:jc w:val="left"/>
         <w:tblInd w:w="-7" w:type="dxa"/>
         <w:tblLayout w:type="fixed"/>
@@ -707,16 +707,16 @@
         </w:tblCellMar>
       </w:tblPr>
       <w:tblGrid>
-        <w:gridCol w:w="1440"/>
-        <w:gridCol w:w="1897"/>
-        <w:gridCol w:w="1897"/>
-        <w:gridCol w:w="1611"/>
+        <w:gridCol w:w="1318"/>
+        <w:gridCol w:w="1643"/>
+        <w:gridCol w:w="1643"/>
+        <w:gridCol w:w="1416"/>
       </w:tblGrid>
       <w:tr>
         <w:trPr/>
         <w:tc>
           <w:tcPr>
-            <w:tcW w:w="1440" w:type="dxa"/>
+            <w:tcW w:w="1318" w:type="dxa"/>
             <w:tcBorders>
               <w:top w:val="double" w:sz="2" w:space="0" w:color="808080"/>
               <w:left w:val="double" w:sz="2" w:space="0" w:color="808080"/>
@@ -743,7 +743,7 @@
         </w:tc>
         <w:tc>
           <w:tcPr>
-            <w:tcW w:w="1897" w:type="dxa"/>
+            <w:tcW w:w="1643" w:type="dxa"/>
             <w:tcBorders>
               <w:top w:val="double" w:sz="2" w:space="0" w:color="808080"/>
               <w:left w:val="double" w:sz="2" w:space="0" w:color="808080"/>
@@ -770,7 +770,7 @@
         </w:tc>
         <w:tc>
           <w:tcPr>
-            <w:tcW w:w="1897" w:type="dxa"/>
+            <w:tcW w:w="1643" w:type="dxa"/>
             <w:tcBorders>
               <w:top w:val="double" w:sz="2" w:space="0" w:color="808080"/>
               <w:left w:val="double" w:sz="2" w:space="0" w:color="808080"/>
@@ -797,7 +797,7 @@
         </w:tc>
         <w:tc>
           <w:tcPr>
-            <w:tcW w:w="1611" w:type="dxa"/>
+            <w:tcW w:w="1416" w:type="dxa"/>
             <w:tcBorders>
               <w:top w:val="double" w:sz="2" w:space="0" w:color="808080"/>
               <w:left w:val="double" w:sz="2" w:space="0" w:color="808080"/>
@@ -827,7 +827,7 @@
         <w:trPr/>
         <w:tc>
           <w:tcPr>
-            <w:tcW w:w="1440" w:type="dxa"/>
+            <w:tcW w:w="1318" w:type="dxa"/>
             <w:tcBorders>
               <w:left w:val="double" w:sz="2" w:space="0" w:color="808080"/>
               <w:bottom w:val="double" w:sz="2" w:space="0" w:color="808080"/>
@@ -851,7 +851,7 @@
         </w:tc>
         <w:tc>
           <w:tcPr>
-            <w:tcW w:w="1897" w:type="dxa"/>
+            <w:tcW w:w="1643" w:type="dxa"/>
             <w:tcBorders>
               <w:left w:val="double" w:sz="2" w:space="0" w:color="808080"/>
               <w:bottom w:val="double" w:sz="2" w:space="0" w:color="808080"/>
@@ -880,7 +880,7 @@
         </w:tc>
         <w:tc>
           <w:tcPr>
-            <w:tcW w:w="1897" w:type="dxa"/>
+            <w:tcW w:w="1643" w:type="dxa"/>
             <w:tcBorders>
               <w:left w:val="double" w:sz="2" w:space="0" w:color="808080"/>
               <w:bottom w:val="double" w:sz="2" w:space="0" w:color="808080"/>
@@ -909,7 +909,7 @@
         </w:tc>
         <w:tc>
           <w:tcPr>
-            <w:tcW w:w="1611" w:type="dxa"/>
+            <w:tcW w:w="1416" w:type="dxa"/>
             <w:tcBorders>
               <w:left w:val="double" w:sz="2" w:space="0" w:color="808080"/>
               <w:bottom w:val="double" w:sz="2" w:space="0" w:color="808080"/>
@@ -941,7 +941,7 @@
         <w:trPr/>
         <w:tc>
           <w:tcPr>
-            <w:tcW w:w="1440" w:type="dxa"/>
+            <w:tcW w:w="1318" w:type="dxa"/>
             <w:tcBorders>
               <w:left w:val="double" w:sz="2" w:space="0" w:color="808080"/>
               <w:bottom w:val="double" w:sz="2" w:space="0" w:color="808080"/>
@@ -965,7 +965,7 @@
         </w:tc>
         <w:tc>
           <w:tcPr>
-            <w:tcW w:w="1897" w:type="dxa"/>
+            <w:tcW w:w="1643" w:type="dxa"/>
             <w:tcBorders>
               <w:left w:val="double" w:sz="2" w:space="0" w:color="808080"/>
               <w:bottom w:val="double" w:sz="2" w:space="0" w:color="808080"/>
@@ -994,7 +994,7 @@
         </w:tc>
         <w:tc>
           <w:tcPr>
-            <w:tcW w:w="1897" w:type="dxa"/>
+            <w:tcW w:w="1643" w:type="dxa"/>
             <w:tcBorders>
               <w:left w:val="double" w:sz="2" w:space="0" w:color="808080"/>
               <w:bottom w:val="double" w:sz="2" w:space="0" w:color="808080"/>
@@ -1023,7 +1023,7 @@
         </w:tc>
         <w:tc>
           <w:tcPr>
-            <w:tcW w:w="1611" w:type="dxa"/>
+            <w:tcW w:w="1416" w:type="dxa"/>
             <w:tcBorders>
               <w:left w:val="double" w:sz="2" w:space="0" w:color="808080"/>
               <w:bottom w:val="double" w:sz="2" w:space="0" w:color="808080"/>
@@ -1055,7 +1055,7 @@
         <w:trPr/>
         <w:tc>
           <w:tcPr>
-            <w:tcW w:w="1440" w:type="dxa"/>
+            <w:tcW w:w="1318" w:type="dxa"/>
             <w:tcBorders>
               <w:left w:val="double" w:sz="2" w:space="0" w:color="808080"/>
               <w:bottom w:val="double" w:sz="2" w:space="0" w:color="808080"/>
@@ -1079,7 +1079,7 @@
         </w:tc>
         <w:tc>
           <w:tcPr>
-            <w:tcW w:w="1897" w:type="dxa"/>
+            <w:tcW w:w="1643" w:type="dxa"/>
             <w:tcBorders>
               <w:left w:val="double" w:sz="2" w:space="0" w:color="808080"/>
               <w:bottom w:val="double" w:sz="2" w:space="0" w:color="808080"/>
@@ -1108,7 +1108,7 @@
         </w:tc>
         <w:tc>
           <w:tcPr>
-            <w:tcW w:w="1897" w:type="dxa"/>
+            <w:tcW w:w="1643" w:type="dxa"/>
             <w:tcBorders>
               <w:left w:val="double" w:sz="2" w:space="0" w:color="808080"/>
               <w:bottom w:val="double" w:sz="2" w:space="0" w:color="808080"/>
@@ -1137,7 +1137,7 @@
         </w:tc>
         <w:tc>
           <w:tcPr>
-            <w:tcW w:w="1611" w:type="dxa"/>
+            <w:tcW w:w="1416" w:type="dxa"/>
             <w:tcBorders>
               <w:left w:val="double" w:sz="2" w:space="0" w:color="808080"/>
               <w:bottom w:val="double" w:sz="2" w:space="0" w:color="808080"/>
@@ -1169,7 +1169,7 @@
         <w:trPr/>
         <w:tc>
           <w:tcPr>
-            <w:tcW w:w="1440" w:type="dxa"/>
+            <w:tcW w:w="1318" w:type="dxa"/>
             <w:tcBorders>
               <w:left w:val="double" w:sz="2" w:space="0" w:color="808080"/>
               <w:bottom w:val="double" w:sz="2" w:space="0" w:color="808080"/>
@@ -1193,7 +1193,7 @@
         </w:tc>
         <w:tc>
           <w:tcPr>
-            <w:tcW w:w="1897" w:type="dxa"/>
+            <w:tcW w:w="1643" w:type="dxa"/>
             <w:tcBorders>
               <w:left w:val="double" w:sz="2" w:space="0" w:color="808080"/>
               <w:bottom w:val="double" w:sz="2" w:space="0" w:color="808080"/>
@@ -1222,7 +1222,7 @@
         </w:tc>
         <w:tc>
           <w:tcPr>
-            <w:tcW w:w="1897" w:type="dxa"/>
+            <w:tcW w:w="1643" w:type="dxa"/>
             <w:tcBorders>
               <w:left w:val="double" w:sz="2" w:space="0" w:color="808080"/>
               <w:bottom w:val="double" w:sz="2" w:space="0" w:color="808080"/>
@@ -1251,7 +1251,7 @@
         </w:tc>
         <w:tc>
           <w:tcPr>
-            <w:tcW w:w="1611" w:type="dxa"/>
+            <w:tcW w:w="1416" w:type="dxa"/>
             <w:tcBorders>
               <w:left w:val="double" w:sz="2" w:space="0" w:color="808080"/>
               <w:bottom w:val="double" w:sz="2" w:space="0" w:color="808080"/>
@@ -1283,7 +1283,7 @@
         <w:trPr/>
         <w:tc>
           <w:tcPr>
-            <w:tcW w:w="1440" w:type="dxa"/>
+            <w:tcW w:w="1318" w:type="dxa"/>
             <w:tcBorders>
               <w:left w:val="double" w:sz="2" w:space="0" w:color="808080"/>
               <w:bottom w:val="double" w:sz="2" w:space="0" w:color="808080"/>
@@ -1307,7 +1307,7 @@
         </w:tc>
         <w:tc>
           <w:tcPr>
-            <w:tcW w:w="1897" w:type="dxa"/>
+            <w:tcW w:w="1643" w:type="dxa"/>
             <w:tcBorders>
               <w:left w:val="double" w:sz="2" w:space="0" w:color="808080"/>
               <w:bottom w:val="double" w:sz="2" w:space="0" w:color="808080"/>
@@ -1336,7 +1336,7 @@
         </w:tc>
         <w:tc>
           <w:tcPr>
-            <w:tcW w:w="1897" w:type="dxa"/>
+            <w:tcW w:w="1643" w:type="dxa"/>
             <w:tcBorders>
               <w:left w:val="double" w:sz="2" w:space="0" w:color="808080"/>
               <w:bottom w:val="double" w:sz="2" w:space="0" w:color="808080"/>
@@ -1365,7 +1365,7 @@
         </w:tc>
         <w:tc>
           <w:tcPr>
-            <w:tcW w:w="1611" w:type="dxa"/>
+            <w:tcW w:w="1416" w:type="dxa"/>
             <w:tcBorders>
               <w:left w:val="double" w:sz="2" w:space="0" w:color="808080"/>
               <w:bottom w:val="double" w:sz="2" w:space="0" w:color="808080"/>
@@ -1397,7 +1397,7 @@
         <w:trPr/>
         <w:tc>
           <w:tcPr>
-            <w:tcW w:w="1440" w:type="dxa"/>
+            <w:tcW w:w="1318" w:type="dxa"/>
             <w:tcBorders>
               <w:left w:val="double" w:sz="2" w:space="0" w:color="808080"/>
               <w:bottom w:val="double" w:sz="2" w:space="0" w:color="808080"/>
@@ -1421,7 +1421,7 @@
         </w:tc>
         <w:tc>
           <w:tcPr>
-            <w:tcW w:w="1897" w:type="dxa"/>
+            <w:tcW w:w="1643" w:type="dxa"/>
             <w:tcBorders>
               <w:left w:val="double" w:sz="2" w:space="0" w:color="808080"/>
               <w:bottom w:val="double" w:sz="2" w:space="0" w:color="808080"/>
@@ -1450,7 +1450,7 @@
         </w:tc>
         <w:tc>
           <w:tcPr>
-            <w:tcW w:w="1897" w:type="dxa"/>
+            <w:tcW w:w="1643" w:type="dxa"/>
             <w:tcBorders>
               <w:left w:val="double" w:sz="2" w:space="0" w:color="808080"/>
               <w:bottom w:val="double" w:sz="2" w:space="0" w:color="808080"/>
@@ -1479,7 +1479,7 @@
         </w:tc>
         <w:tc>
           <w:tcPr>
-            <w:tcW w:w="1611" w:type="dxa"/>
+            <w:tcW w:w="1416" w:type="dxa"/>
             <w:tcBorders>
               <w:left w:val="double" w:sz="2" w:space="0" w:color="808080"/>
               <w:bottom w:val="double" w:sz="2" w:space="0" w:color="808080"/>
@@ -1511,7 +1511,7 @@
         <w:trPr/>
         <w:tc>
           <w:tcPr>
-            <w:tcW w:w="1440" w:type="dxa"/>
+            <w:tcW w:w="1318" w:type="dxa"/>
             <w:tcBorders>
               <w:left w:val="double" w:sz="2" w:space="0" w:color="808080"/>
               <w:bottom w:val="double" w:sz="2" w:space="0" w:color="808080"/>
@@ -1535,7 +1535,7 @@
         </w:tc>
         <w:tc>
           <w:tcPr>
-            <w:tcW w:w="1897" w:type="dxa"/>
+            <w:tcW w:w="1643" w:type="dxa"/>
             <w:tcBorders>
               <w:left w:val="double" w:sz="2" w:space="0" w:color="808080"/>
               <w:bottom w:val="double" w:sz="2" w:space="0" w:color="808080"/>
@@ -1564,7 +1564,7 @@
         </w:tc>
         <w:tc>
           <w:tcPr>
-            <w:tcW w:w="1897" w:type="dxa"/>
+            <w:tcW w:w="1643" w:type="dxa"/>
             <w:tcBorders>
               <w:left w:val="double" w:sz="2" w:space="0" w:color="808080"/>
               <w:bottom w:val="double" w:sz="2" w:space="0" w:color="808080"/>
@@ -1593,7 +1593,7 @@
         </w:tc>
         <w:tc>
           <w:tcPr>
-            <w:tcW w:w="1611" w:type="dxa"/>
+            <w:tcW w:w="1416" w:type="dxa"/>
             <w:tcBorders>
               <w:left w:val="double" w:sz="2" w:space="0" w:color="808080"/>
               <w:bottom w:val="double" w:sz="2" w:space="0" w:color="808080"/>
@@ -1625,7 +1625,7 @@
         <w:trPr/>
         <w:tc>
           <w:tcPr>
-            <w:tcW w:w="1440" w:type="dxa"/>
+            <w:tcW w:w="1318" w:type="dxa"/>
             <w:tcBorders>
               <w:left w:val="double" w:sz="2" w:space="0" w:color="808080"/>
               <w:bottom w:val="double" w:sz="2" w:space="0" w:color="808080"/>
@@ -1649,7 +1649,7 @@
         </w:tc>
         <w:tc>
           <w:tcPr>
-            <w:tcW w:w="1897" w:type="dxa"/>
+            <w:tcW w:w="1643" w:type="dxa"/>
             <w:tcBorders>
               <w:left w:val="double" w:sz="2" w:space="0" w:color="808080"/>
               <w:bottom w:val="double" w:sz="2" w:space="0" w:color="808080"/>
@@ -1678,7 +1678,7 @@
         </w:tc>
         <w:tc>
           <w:tcPr>
-            <w:tcW w:w="1897" w:type="dxa"/>
+            <w:tcW w:w="1643" w:type="dxa"/>
             <w:tcBorders>
               <w:left w:val="double" w:sz="2" w:space="0" w:color="808080"/>
               <w:bottom w:val="double" w:sz="2" w:space="0" w:color="808080"/>
@@ -1707,7 +1707,7 @@
         </w:tc>
         <w:tc>
           <w:tcPr>
-            <w:tcW w:w="1611" w:type="dxa"/>
+            <w:tcW w:w="1416" w:type="dxa"/>
             <w:tcBorders>
               <w:left w:val="double" w:sz="2" w:space="0" w:color="808080"/>
               <w:bottom w:val="double" w:sz="2" w:space="0" w:color="808080"/>
@@ -1762,7 +1762,7 @@
     </w:p>
     <w:tbl>
       <w:tblPr>
-        <w:tblW w:w="330" w:type="dxa"/>
+        <w:tblW w:w="315" w:type="dxa"/>
         <w:jc w:val="left"/>
         <w:tblInd w:w="-7" w:type="dxa"/>
         <w:tblLayout w:type="fixed"/>
@@ -1774,13 +1774,13 @@
         </w:tblCellMar>
       </w:tblPr>
       <w:tblGrid>
-        <w:gridCol w:w="330"/>
+        <w:gridCol w:w="315"/>
       </w:tblGrid>
       <w:tr>
         <w:trPr/>
         <w:tc>
           <w:tcPr>
-            <w:tcW w:w="330" w:type="dxa"/>
+            <w:tcW w:w="315" w:type="dxa"/>
             <w:tcBorders>
               <w:top w:val="double" w:sz="2" w:space="0" w:color="808080"/>
               <w:left w:val="double" w:sz="2" w:space="0" w:color="808080"/>
@@ -1824,7 +1824,7 @@
     </w:p>
     <w:tbl>
       <w:tblPr>
-        <w:tblW w:w="330" w:type="dxa"/>
+        <w:tblW w:w="315" w:type="dxa"/>
         <w:jc w:val="left"/>
         <w:tblInd w:w="-7" w:type="dxa"/>
         <w:tblLayout w:type="fixed"/>
@@ -1836,13 +1836,13 @@
         </w:tblCellMar>
       </w:tblPr>
       <w:tblGrid>
-        <w:gridCol w:w="330"/>
+        <w:gridCol w:w="315"/>
       </w:tblGrid>
       <w:tr>
         <w:trPr/>
         <w:tc>
           <w:tcPr>
-            <w:tcW w:w="330" w:type="dxa"/>
+            <w:tcW w:w="315" w:type="dxa"/>
             <w:tcBorders>
               <w:top w:val="double" w:sz="2" w:space="0" w:color="808080"/>
               <w:left w:val="double" w:sz="2" w:space="0" w:color="808080"/>
@@ -1886,7 +1886,7 @@
     </w:p>
     <w:tbl>
       <w:tblPr>
-        <w:tblW w:w="330" w:type="dxa"/>
+        <w:tblW w:w="315" w:type="dxa"/>
         <w:jc w:val="left"/>
         <w:tblInd w:w="-7" w:type="dxa"/>
         <w:tblLayout w:type="fixed"/>
@@ -1898,13 +1898,13 @@
         </w:tblCellMar>
       </w:tblPr>
       <w:tblGrid>
-        <w:gridCol w:w="330"/>
+        <w:gridCol w:w="315"/>
       </w:tblGrid>
       <w:tr>
         <w:trPr/>
         <w:tc>
           <w:tcPr>
-            <w:tcW w:w="330" w:type="dxa"/>
+            <w:tcW w:w="315" w:type="dxa"/>
             <w:tcBorders>
               <w:top w:val="double" w:sz="2" w:space="0" w:color="808080"/>
               <w:left w:val="double" w:sz="2" w:space="0" w:color="808080"/>
@@ -1955,7 +1955,7 @@
       </w:pPr>
       <w:r>
         <w:rPr/>
-        <w:t>7. Instrução do MVP Zero, ou prompts por etapa na variante de fluxo</w:t>
+        <w:t>7. Instrução do MVP Zero (skill), ou uma skill por etapa na variante de fluxo</w:t>
       </w:r>
     </w:p>
     <w:p>
@@ -1972,7 +1972,7 @@
     </w:p>
     <w:tbl>
       <w:tblPr>
-        <w:tblW w:w="330" w:type="dxa"/>
+        <w:tblW w:w="315" w:type="dxa"/>
         <w:jc w:val="left"/>
         <w:tblInd w:w="-7" w:type="dxa"/>
         <w:tblLayout w:type="fixed"/>
@@ -1984,13 +1984,13 @@
         </w:tblCellMar>
       </w:tblPr>
       <w:tblGrid>
-        <w:gridCol w:w="330"/>
+        <w:gridCol w:w="315"/>
       </w:tblGrid>
       <w:tr>
         <w:trPr/>
         <w:tc>
           <w:tcPr>
-            <w:tcW w:w="330" w:type="dxa"/>
+            <w:tcW w:w="315" w:type="dxa"/>
             <w:tcBorders>
               <w:top w:val="double" w:sz="2" w:space="0" w:color="808080"/>
               <w:left w:val="double" w:sz="2" w:space="0" w:color="808080"/>
@@ -2042,7 +2042,7 @@
     </w:p>
     <w:tbl>
       <w:tblPr>
-        <w:tblW w:w="330" w:type="dxa"/>
+        <w:tblW w:w="315" w:type="dxa"/>
         <w:jc w:val="left"/>
         <w:tblInd w:w="-7" w:type="dxa"/>
         <w:tblLayout w:type="fixed"/>
@@ -2054,13 +2054,13 @@
         </w:tblCellMar>
       </w:tblPr>
       <w:tblGrid>
-        <w:gridCol w:w="330"/>
+        <w:gridCol w:w="315"/>
       </w:tblGrid>
       <w:tr>
         <w:trPr/>
         <w:tc>
           <w:tcPr>
-            <w:tcW w:w="330" w:type="dxa"/>
+            <w:tcW w:w="315" w:type="dxa"/>
             <w:tcBorders>
               <w:top w:val="double" w:sz="2" w:space="0" w:color="808080"/>
               <w:left w:val="double" w:sz="2" w:space="0" w:color="808080"/>
@@ -2106,7 +2106,7 @@
     </w:p>
     <w:tbl>
       <w:tblPr>
-        <w:tblW w:w="330" w:type="dxa"/>
+        <w:tblW w:w="315" w:type="dxa"/>
         <w:jc w:val="left"/>
         <w:tblInd w:w="-7" w:type="dxa"/>
         <w:tblLayout w:type="fixed"/>
@@ -2118,13 +2118,13 @@
         </w:tblCellMar>
       </w:tblPr>
       <w:tblGrid>
-        <w:gridCol w:w="330"/>
+        <w:gridCol w:w="315"/>
       </w:tblGrid>
       <w:tr>
         <w:trPr/>
         <w:tc>
           <w:tcPr>
-            <w:tcW w:w="330" w:type="dxa"/>
+            <w:tcW w:w="315" w:type="dxa"/>
             <w:tcBorders>
               <w:top w:val="double" w:sz="2" w:space="0" w:color="808080"/>
               <w:left w:val="double" w:sz="2" w:space="0" w:color="808080"/>
@@ -2371,7 +2371,7 @@
     </w:p>
     <w:tbl>
       <w:tblPr>
-        <w:tblW w:w="6845" w:type="dxa"/>
+        <w:tblW w:w="6020" w:type="dxa"/>
         <w:jc w:val="left"/>
         <w:tblInd w:w="-7" w:type="dxa"/>
         <w:tblLayout w:type="fixed"/>
@@ -2383,19 +2383,19 @@
         </w:tblCellMar>
       </w:tblPr>
       <w:tblGrid>
-        <w:gridCol w:w="935"/>
-        <w:gridCol w:w="1535"/>
-        <w:gridCol w:w="905"/>
-        <w:gridCol w:w="710"/>
-        <w:gridCol w:w="710"/>
-        <w:gridCol w:w="710"/>
-        <w:gridCol w:w="1340"/>
+        <w:gridCol w:w="830"/>
+        <w:gridCol w:w="1370"/>
+        <w:gridCol w:w="830"/>
+        <w:gridCol w:w="605"/>
+        <w:gridCol w:w="605"/>
+        <w:gridCol w:w="605"/>
+        <w:gridCol w:w="1175"/>
       </w:tblGrid>
       <w:tr>
         <w:trPr/>
         <w:tc>
           <w:tcPr>
-            <w:tcW w:w="935" w:type="dxa"/>
+            <w:tcW w:w="830" w:type="dxa"/>
             <w:tcBorders>
               <w:top w:val="double" w:sz="2" w:space="0" w:color="808080"/>
               <w:left w:val="double" w:sz="2" w:space="0" w:color="808080"/>
@@ -2422,7 +2422,7 @@
         </w:tc>
         <w:tc>
           <w:tcPr>
-            <w:tcW w:w="1535" w:type="dxa"/>
+            <w:tcW w:w="1370" w:type="dxa"/>
             <w:tcBorders>
               <w:top w:val="double" w:sz="2" w:space="0" w:color="808080"/>
               <w:left w:val="double" w:sz="2" w:space="0" w:color="808080"/>
@@ -2449,7 +2449,7 @@
         </w:tc>
         <w:tc>
           <w:tcPr>
-            <w:tcW w:w="905" w:type="dxa"/>
+            <w:tcW w:w="830" w:type="dxa"/>
             <w:tcBorders>
               <w:top w:val="double" w:sz="2" w:space="0" w:color="808080"/>
               <w:left w:val="double" w:sz="2" w:space="0" w:color="808080"/>
@@ -2476,7 +2476,7 @@
         </w:tc>
         <w:tc>
           <w:tcPr>
-            <w:tcW w:w="710" w:type="dxa"/>
+            <w:tcW w:w="605" w:type="dxa"/>
             <w:tcBorders>
               <w:top w:val="double" w:sz="2" w:space="0" w:color="808080"/>
               <w:left w:val="double" w:sz="2" w:space="0" w:color="808080"/>
@@ -2503,7 +2503,7 @@
         </w:tc>
         <w:tc>
           <w:tcPr>
-            <w:tcW w:w="710" w:type="dxa"/>
+            <w:tcW w:w="605" w:type="dxa"/>
             <w:tcBorders>
               <w:top w:val="double" w:sz="2" w:space="0" w:color="808080"/>
               <w:left w:val="double" w:sz="2" w:space="0" w:color="808080"/>
@@ -2530,7 +2530,7 @@
         </w:tc>
         <w:tc>
           <w:tcPr>
-            <w:tcW w:w="710" w:type="dxa"/>
+            <w:tcW w:w="605" w:type="dxa"/>
             <w:tcBorders>
               <w:top w:val="double" w:sz="2" w:space="0" w:color="808080"/>
               <w:left w:val="double" w:sz="2" w:space="0" w:color="808080"/>
@@ -2557,7 +2557,7 @@
         </w:tc>
         <w:tc>
           <w:tcPr>
-            <w:tcW w:w="1340" w:type="dxa"/>
+            <w:tcW w:w="1175" w:type="dxa"/>
             <w:tcBorders>
               <w:top w:val="double" w:sz="2" w:space="0" w:color="808080"/>
               <w:left w:val="double" w:sz="2" w:space="0" w:color="808080"/>
@@ -2587,7 +2587,7 @@
         <w:trPr/>
         <w:tc>
           <w:tcPr>
-            <w:tcW w:w="935" w:type="dxa"/>
+            <w:tcW w:w="830" w:type="dxa"/>
             <w:tcBorders>
               <w:left w:val="double" w:sz="2" w:space="0" w:color="808080"/>
               <w:bottom w:val="double" w:sz="2" w:space="0" w:color="808080"/>
@@ -2611,7 +2611,7 @@
         </w:tc>
         <w:tc>
           <w:tcPr>
-            <w:tcW w:w="1535" w:type="dxa"/>
+            <w:tcW w:w="1370" w:type="dxa"/>
             <w:tcBorders>
               <w:left w:val="double" w:sz="2" w:space="0" w:color="808080"/>
               <w:bottom w:val="double" w:sz="2" w:space="0" w:color="808080"/>
@@ -2635,7 +2635,7 @@
         </w:tc>
         <w:tc>
           <w:tcPr>
-            <w:tcW w:w="905" w:type="dxa"/>
+            <w:tcW w:w="830" w:type="dxa"/>
             <w:tcBorders>
               <w:left w:val="double" w:sz="2" w:space="0" w:color="808080"/>
               <w:bottom w:val="double" w:sz="2" w:space="0" w:color="808080"/>
@@ -2659,79 +2659,79 @@
         </w:tc>
         <w:tc>
           <w:tcPr>
-            <w:tcW w:w="710" w:type="dxa"/>
-            <w:tcBorders>
-              <w:left w:val="double" w:sz="2" w:space="0" w:color="808080"/>
-              <w:bottom w:val="double" w:sz="2" w:space="0" w:color="808080"/>
-              <w:right w:val="double" w:sz="2" w:space="0" w:color="808080"/>
-            </w:tcBorders>
-            <w:vAlign w:val="center"/>
-          </w:tcPr>
-          <w:p>
-            <w:pPr>
-              <w:pStyle w:val="Contedodatabela"/>
-              <w:bidi w:val="0"/>
-              <w:spacing w:before="0" w:after="283"/>
-              <w:jc w:val="left"/>
-              <w:rPr/>
-            </w:pPr>
-            <w:r>
-              <w:rPr/>
-              <w:t> </w:t>
-            </w:r>
-          </w:p>
-        </w:tc>
-        <w:tc>
-          <w:tcPr>
-            <w:tcW w:w="710" w:type="dxa"/>
-            <w:tcBorders>
-              <w:left w:val="double" w:sz="2" w:space="0" w:color="808080"/>
-              <w:bottom w:val="double" w:sz="2" w:space="0" w:color="808080"/>
-              <w:right w:val="double" w:sz="2" w:space="0" w:color="808080"/>
-            </w:tcBorders>
-            <w:vAlign w:val="center"/>
-          </w:tcPr>
-          <w:p>
-            <w:pPr>
-              <w:pStyle w:val="Contedodatabela"/>
-              <w:bidi w:val="0"/>
-              <w:spacing w:before="0" w:after="283"/>
-              <w:jc w:val="left"/>
-              <w:rPr/>
-            </w:pPr>
-            <w:r>
-              <w:rPr/>
-              <w:t> </w:t>
-            </w:r>
-          </w:p>
-        </w:tc>
-        <w:tc>
-          <w:tcPr>
-            <w:tcW w:w="710" w:type="dxa"/>
-            <w:tcBorders>
-              <w:left w:val="double" w:sz="2" w:space="0" w:color="808080"/>
-              <w:bottom w:val="double" w:sz="2" w:space="0" w:color="808080"/>
-              <w:right w:val="double" w:sz="2" w:space="0" w:color="808080"/>
-            </w:tcBorders>
-            <w:vAlign w:val="center"/>
-          </w:tcPr>
-          <w:p>
-            <w:pPr>
-              <w:pStyle w:val="Contedodatabela"/>
-              <w:bidi w:val="0"/>
-              <w:spacing w:before="0" w:after="283"/>
-              <w:jc w:val="left"/>
-              <w:rPr/>
-            </w:pPr>
-            <w:r>
-              <w:rPr/>
-              <w:t> </w:t>
-            </w:r>
-          </w:p>
-        </w:tc>
-        <w:tc>
-          <w:tcPr>
-            <w:tcW w:w="1340" w:type="dxa"/>
+            <w:tcW w:w="605" w:type="dxa"/>
+            <w:tcBorders>
+              <w:left w:val="double" w:sz="2" w:space="0" w:color="808080"/>
+              <w:bottom w:val="double" w:sz="2" w:space="0" w:color="808080"/>
+              <w:right w:val="double" w:sz="2" w:space="0" w:color="808080"/>
+            </w:tcBorders>
+            <w:vAlign w:val="center"/>
+          </w:tcPr>
+          <w:p>
+            <w:pPr>
+              <w:pStyle w:val="Contedodatabela"/>
+              <w:bidi w:val="0"/>
+              <w:spacing w:before="0" w:after="283"/>
+              <w:jc w:val="left"/>
+              <w:rPr/>
+            </w:pPr>
+            <w:r>
+              <w:rPr/>
+              <w:t> </w:t>
+            </w:r>
+          </w:p>
+        </w:tc>
+        <w:tc>
+          <w:tcPr>
+            <w:tcW w:w="605" w:type="dxa"/>
+            <w:tcBorders>
+              <w:left w:val="double" w:sz="2" w:space="0" w:color="808080"/>
+              <w:bottom w:val="double" w:sz="2" w:space="0" w:color="808080"/>
+              <w:right w:val="double" w:sz="2" w:space="0" w:color="808080"/>
+            </w:tcBorders>
+            <w:vAlign w:val="center"/>
+          </w:tcPr>
+          <w:p>
+            <w:pPr>
+              <w:pStyle w:val="Contedodatabela"/>
+              <w:bidi w:val="0"/>
+              <w:spacing w:before="0" w:after="283"/>
+              <w:jc w:val="left"/>
+              <w:rPr/>
+            </w:pPr>
+            <w:r>
+              <w:rPr/>
+              <w:t> </w:t>
+            </w:r>
+          </w:p>
+        </w:tc>
+        <w:tc>
+          <w:tcPr>
+            <w:tcW w:w="605" w:type="dxa"/>
+            <w:tcBorders>
+              <w:left w:val="double" w:sz="2" w:space="0" w:color="808080"/>
+              <w:bottom w:val="double" w:sz="2" w:space="0" w:color="808080"/>
+              <w:right w:val="double" w:sz="2" w:space="0" w:color="808080"/>
+            </w:tcBorders>
+            <w:vAlign w:val="center"/>
+          </w:tcPr>
+          <w:p>
+            <w:pPr>
+              <w:pStyle w:val="Contedodatabela"/>
+              <w:bidi w:val="0"/>
+              <w:spacing w:before="0" w:after="283"/>
+              <w:jc w:val="left"/>
+              <w:rPr/>
+            </w:pPr>
+            <w:r>
+              <w:rPr/>
+              <w:t> </w:t>
+            </w:r>
+          </w:p>
+        </w:tc>
+        <w:tc>
+          <w:tcPr>
+            <w:tcW w:w="1175" w:type="dxa"/>
             <w:tcBorders>
               <w:left w:val="double" w:sz="2" w:space="0" w:color="808080"/>
               <w:bottom w:val="double" w:sz="2" w:space="0" w:color="808080"/>
@@ -2758,7 +2758,7 @@
         <w:trPr/>
         <w:tc>
           <w:tcPr>
-            <w:tcW w:w="935" w:type="dxa"/>
+            <w:tcW w:w="830" w:type="dxa"/>
             <w:tcBorders>
               <w:left w:val="double" w:sz="2" w:space="0" w:color="808080"/>
               <w:bottom w:val="double" w:sz="2" w:space="0" w:color="808080"/>
@@ -2782,127 +2782,127 @@
         </w:tc>
         <w:tc>
           <w:tcPr>
-            <w:tcW w:w="1535" w:type="dxa"/>
-            <w:tcBorders>
-              <w:left w:val="double" w:sz="2" w:space="0" w:color="808080"/>
-              <w:bottom w:val="double" w:sz="2" w:space="0" w:color="808080"/>
-              <w:right w:val="double" w:sz="2" w:space="0" w:color="808080"/>
-            </w:tcBorders>
-            <w:vAlign w:val="center"/>
-          </w:tcPr>
-          <w:p>
-            <w:pPr>
-              <w:pStyle w:val="Contedodatabela"/>
-              <w:bidi w:val="0"/>
-              <w:spacing w:before="0" w:after="283"/>
-              <w:jc w:val="left"/>
-              <w:rPr/>
-            </w:pPr>
-            <w:r>
-              <w:rPr/>
-              <w:t> </w:t>
-            </w:r>
-          </w:p>
-        </w:tc>
-        <w:tc>
-          <w:tcPr>
-            <w:tcW w:w="905" w:type="dxa"/>
-            <w:tcBorders>
-              <w:left w:val="double" w:sz="2" w:space="0" w:color="808080"/>
-              <w:bottom w:val="double" w:sz="2" w:space="0" w:color="808080"/>
-              <w:right w:val="double" w:sz="2" w:space="0" w:color="808080"/>
-            </w:tcBorders>
-            <w:vAlign w:val="center"/>
-          </w:tcPr>
-          <w:p>
-            <w:pPr>
-              <w:pStyle w:val="Contedodatabela"/>
-              <w:bidi w:val="0"/>
-              <w:spacing w:before="0" w:after="283"/>
-              <w:jc w:val="left"/>
-              <w:rPr/>
-            </w:pPr>
-            <w:r>
-              <w:rPr/>
-              <w:t> </w:t>
-            </w:r>
-          </w:p>
-        </w:tc>
-        <w:tc>
-          <w:tcPr>
-            <w:tcW w:w="710" w:type="dxa"/>
-            <w:tcBorders>
-              <w:left w:val="double" w:sz="2" w:space="0" w:color="808080"/>
-              <w:bottom w:val="double" w:sz="2" w:space="0" w:color="808080"/>
-              <w:right w:val="double" w:sz="2" w:space="0" w:color="808080"/>
-            </w:tcBorders>
-            <w:vAlign w:val="center"/>
-          </w:tcPr>
-          <w:p>
-            <w:pPr>
-              <w:pStyle w:val="Contedodatabela"/>
-              <w:bidi w:val="0"/>
-              <w:spacing w:before="0" w:after="283"/>
-              <w:jc w:val="left"/>
-              <w:rPr/>
-            </w:pPr>
-            <w:r>
-              <w:rPr/>
-              <w:t> </w:t>
-            </w:r>
-          </w:p>
-        </w:tc>
-        <w:tc>
-          <w:tcPr>
-            <w:tcW w:w="710" w:type="dxa"/>
-            <w:tcBorders>
-              <w:left w:val="double" w:sz="2" w:space="0" w:color="808080"/>
-              <w:bottom w:val="double" w:sz="2" w:space="0" w:color="808080"/>
-              <w:right w:val="double" w:sz="2" w:space="0" w:color="808080"/>
-            </w:tcBorders>
-            <w:vAlign w:val="center"/>
-          </w:tcPr>
-          <w:p>
-            <w:pPr>
-              <w:pStyle w:val="Contedodatabela"/>
-              <w:bidi w:val="0"/>
-              <w:spacing w:before="0" w:after="283"/>
-              <w:jc w:val="left"/>
-              <w:rPr/>
-            </w:pPr>
-            <w:r>
-              <w:rPr/>
-              <w:t> </w:t>
-            </w:r>
-          </w:p>
-        </w:tc>
-        <w:tc>
-          <w:tcPr>
-            <w:tcW w:w="710" w:type="dxa"/>
-            <w:tcBorders>
-              <w:left w:val="double" w:sz="2" w:space="0" w:color="808080"/>
-              <w:bottom w:val="double" w:sz="2" w:space="0" w:color="808080"/>
-              <w:right w:val="double" w:sz="2" w:space="0" w:color="808080"/>
-            </w:tcBorders>
-            <w:vAlign w:val="center"/>
-          </w:tcPr>
-          <w:p>
-            <w:pPr>
-              <w:pStyle w:val="Contedodatabela"/>
-              <w:bidi w:val="0"/>
-              <w:spacing w:before="0" w:after="283"/>
-              <w:jc w:val="left"/>
-              <w:rPr/>
-            </w:pPr>
-            <w:r>
-              <w:rPr/>
-              <w:t> </w:t>
-            </w:r>
-          </w:p>
-        </w:tc>
-        <w:tc>
-          <w:tcPr>
-            <w:tcW w:w="1340" w:type="dxa"/>
+            <w:tcW w:w="1370" w:type="dxa"/>
+            <w:tcBorders>
+              <w:left w:val="double" w:sz="2" w:space="0" w:color="808080"/>
+              <w:bottom w:val="double" w:sz="2" w:space="0" w:color="808080"/>
+              <w:right w:val="double" w:sz="2" w:space="0" w:color="808080"/>
+            </w:tcBorders>
+            <w:vAlign w:val="center"/>
+          </w:tcPr>
+          <w:p>
+            <w:pPr>
+              <w:pStyle w:val="Contedodatabela"/>
+              <w:bidi w:val="0"/>
+              <w:spacing w:before="0" w:after="283"/>
+              <w:jc w:val="left"/>
+              <w:rPr/>
+            </w:pPr>
+            <w:r>
+              <w:rPr/>
+              <w:t> </w:t>
+            </w:r>
+          </w:p>
+        </w:tc>
+        <w:tc>
+          <w:tcPr>
+            <w:tcW w:w="830" w:type="dxa"/>
+            <w:tcBorders>
+              <w:left w:val="double" w:sz="2" w:space="0" w:color="808080"/>
+              <w:bottom w:val="double" w:sz="2" w:space="0" w:color="808080"/>
+              <w:right w:val="double" w:sz="2" w:space="0" w:color="808080"/>
+            </w:tcBorders>
+            <w:vAlign w:val="center"/>
+          </w:tcPr>
+          <w:p>
+            <w:pPr>
+              <w:pStyle w:val="Contedodatabela"/>
+              <w:bidi w:val="0"/>
+              <w:spacing w:before="0" w:after="283"/>
+              <w:jc w:val="left"/>
+              <w:rPr/>
+            </w:pPr>
+            <w:r>
+              <w:rPr/>
+              <w:t> </w:t>
+            </w:r>
+          </w:p>
+        </w:tc>
+        <w:tc>
+          <w:tcPr>
+            <w:tcW w:w="605" w:type="dxa"/>
+            <w:tcBorders>
+              <w:left w:val="double" w:sz="2" w:space="0" w:color="808080"/>
+              <w:bottom w:val="double" w:sz="2" w:space="0" w:color="808080"/>
+              <w:right w:val="double" w:sz="2" w:space="0" w:color="808080"/>
+            </w:tcBorders>
+            <w:vAlign w:val="center"/>
+          </w:tcPr>
+          <w:p>
+            <w:pPr>
+              <w:pStyle w:val="Contedodatabela"/>
+              <w:bidi w:val="0"/>
+              <w:spacing w:before="0" w:after="283"/>
+              <w:jc w:val="left"/>
+              <w:rPr/>
+            </w:pPr>
+            <w:r>
+              <w:rPr/>
+              <w:t> </w:t>
+            </w:r>
+          </w:p>
+        </w:tc>
+        <w:tc>
+          <w:tcPr>
+            <w:tcW w:w="605" w:type="dxa"/>
+            <w:tcBorders>
+              <w:left w:val="double" w:sz="2" w:space="0" w:color="808080"/>
+              <w:bottom w:val="double" w:sz="2" w:space="0" w:color="808080"/>
+              <w:right w:val="double" w:sz="2" w:space="0" w:color="808080"/>
+            </w:tcBorders>
+            <w:vAlign w:val="center"/>
+          </w:tcPr>
+          <w:p>
+            <w:pPr>
+              <w:pStyle w:val="Contedodatabela"/>
+              <w:bidi w:val="0"/>
+              <w:spacing w:before="0" w:after="283"/>
+              <w:jc w:val="left"/>
+              <w:rPr/>
+            </w:pPr>
+            <w:r>
+              <w:rPr/>
+              <w:t> </w:t>
+            </w:r>
+          </w:p>
+        </w:tc>
+        <w:tc>
+          <w:tcPr>
+            <w:tcW w:w="605" w:type="dxa"/>
+            <w:tcBorders>
+              <w:left w:val="double" w:sz="2" w:space="0" w:color="808080"/>
+              <w:bottom w:val="double" w:sz="2" w:space="0" w:color="808080"/>
+              <w:right w:val="double" w:sz="2" w:space="0" w:color="808080"/>
+            </w:tcBorders>
+            <w:vAlign w:val="center"/>
+          </w:tcPr>
+          <w:p>
+            <w:pPr>
+              <w:pStyle w:val="Contedodatabela"/>
+              <w:bidi w:val="0"/>
+              <w:spacing w:before="0" w:after="283"/>
+              <w:jc w:val="left"/>
+              <w:rPr/>
+            </w:pPr>
+            <w:r>
+              <w:rPr/>
+              <w:t> </w:t>
+            </w:r>
+          </w:p>
+        </w:tc>
+        <w:tc>
+          <w:tcPr>
+            <w:tcW w:w="1175" w:type="dxa"/>
             <w:tcBorders>
               <w:left w:val="double" w:sz="2" w:space="0" w:color="808080"/>
               <w:bottom w:val="double" w:sz="2" w:space="0" w:color="808080"/>
@@ -2929,7 +2929,7 @@
         <w:trPr/>
         <w:tc>
           <w:tcPr>
-            <w:tcW w:w="935" w:type="dxa"/>
+            <w:tcW w:w="830" w:type="dxa"/>
             <w:tcBorders>
               <w:left w:val="double" w:sz="2" w:space="0" w:color="808080"/>
               <w:bottom w:val="double" w:sz="2" w:space="0" w:color="808080"/>
@@ -2953,127 +2953,127 @@
         </w:tc>
         <w:tc>
           <w:tcPr>
-            <w:tcW w:w="1535" w:type="dxa"/>
-            <w:tcBorders>
-              <w:left w:val="double" w:sz="2" w:space="0" w:color="808080"/>
-              <w:bottom w:val="double" w:sz="2" w:space="0" w:color="808080"/>
-              <w:right w:val="double" w:sz="2" w:space="0" w:color="808080"/>
-            </w:tcBorders>
-            <w:vAlign w:val="center"/>
-          </w:tcPr>
-          <w:p>
-            <w:pPr>
-              <w:pStyle w:val="Contedodatabela"/>
-              <w:bidi w:val="0"/>
-              <w:spacing w:before="0" w:after="283"/>
-              <w:jc w:val="left"/>
-              <w:rPr/>
-            </w:pPr>
-            <w:r>
-              <w:rPr/>
-              <w:t> </w:t>
-            </w:r>
-          </w:p>
-        </w:tc>
-        <w:tc>
-          <w:tcPr>
-            <w:tcW w:w="905" w:type="dxa"/>
-            <w:tcBorders>
-              <w:left w:val="double" w:sz="2" w:space="0" w:color="808080"/>
-              <w:bottom w:val="double" w:sz="2" w:space="0" w:color="808080"/>
-              <w:right w:val="double" w:sz="2" w:space="0" w:color="808080"/>
-            </w:tcBorders>
-            <w:vAlign w:val="center"/>
-          </w:tcPr>
-          <w:p>
-            <w:pPr>
-              <w:pStyle w:val="Contedodatabela"/>
-              <w:bidi w:val="0"/>
-              <w:spacing w:before="0" w:after="283"/>
-              <w:jc w:val="left"/>
-              <w:rPr/>
-            </w:pPr>
-            <w:r>
-              <w:rPr/>
-              <w:t> </w:t>
-            </w:r>
-          </w:p>
-        </w:tc>
-        <w:tc>
-          <w:tcPr>
-            <w:tcW w:w="710" w:type="dxa"/>
-            <w:tcBorders>
-              <w:left w:val="double" w:sz="2" w:space="0" w:color="808080"/>
-              <w:bottom w:val="double" w:sz="2" w:space="0" w:color="808080"/>
-              <w:right w:val="double" w:sz="2" w:space="0" w:color="808080"/>
-            </w:tcBorders>
-            <w:vAlign w:val="center"/>
-          </w:tcPr>
-          <w:p>
-            <w:pPr>
-              <w:pStyle w:val="Contedodatabela"/>
-              <w:bidi w:val="0"/>
-              <w:spacing w:before="0" w:after="283"/>
-              <w:jc w:val="left"/>
-              <w:rPr/>
-            </w:pPr>
-            <w:r>
-              <w:rPr/>
-              <w:t> </w:t>
-            </w:r>
-          </w:p>
-        </w:tc>
-        <w:tc>
-          <w:tcPr>
-            <w:tcW w:w="710" w:type="dxa"/>
-            <w:tcBorders>
-              <w:left w:val="double" w:sz="2" w:space="0" w:color="808080"/>
-              <w:bottom w:val="double" w:sz="2" w:space="0" w:color="808080"/>
-              <w:right w:val="double" w:sz="2" w:space="0" w:color="808080"/>
-            </w:tcBorders>
-            <w:vAlign w:val="center"/>
-          </w:tcPr>
-          <w:p>
-            <w:pPr>
-              <w:pStyle w:val="Contedodatabela"/>
-              <w:bidi w:val="0"/>
-              <w:spacing w:before="0" w:after="283"/>
-              <w:jc w:val="left"/>
-              <w:rPr/>
-            </w:pPr>
-            <w:r>
-              <w:rPr/>
-              <w:t> </w:t>
-            </w:r>
-          </w:p>
-        </w:tc>
-        <w:tc>
-          <w:tcPr>
-            <w:tcW w:w="710" w:type="dxa"/>
-            <w:tcBorders>
-              <w:left w:val="double" w:sz="2" w:space="0" w:color="808080"/>
-              <w:bottom w:val="double" w:sz="2" w:space="0" w:color="808080"/>
-              <w:right w:val="double" w:sz="2" w:space="0" w:color="808080"/>
-            </w:tcBorders>
-            <w:vAlign w:val="center"/>
-          </w:tcPr>
-          <w:p>
-            <w:pPr>
-              <w:pStyle w:val="Contedodatabela"/>
-              <w:bidi w:val="0"/>
-              <w:spacing w:before="0" w:after="283"/>
-              <w:jc w:val="left"/>
-              <w:rPr/>
-            </w:pPr>
-            <w:r>
-              <w:rPr/>
-              <w:t> </w:t>
-            </w:r>
-          </w:p>
-        </w:tc>
-        <w:tc>
-          <w:tcPr>
-            <w:tcW w:w="1340" w:type="dxa"/>
+            <w:tcW w:w="1370" w:type="dxa"/>
+            <w:tcBorders>
+              <w:left w:val="double" w:sz="2" w:space="0" w:color="808080"/>
+              <w:bottom w:val="double" w:sz="2" w:space="0" w:color="808080"/>
+              <w:right w:val="double" w:sz="2" w:space="0" w:color="808080"/>
+            </w:tcBorders>
+            <w:vAlign w:val="center"/>
+          </w:tcPr>
+          <w:p>
+            <w:pPr>
+              <w:pStyle w:val="Contedodatabela"/>
+              <w:bidi w:val="0"/>
+              <w:spacing w:before="0" w:after="283"/>
+              <w:jc w:val="left"/>
+              <w:rPr/>
+            </w:pPr>
+            <w:r>
+              <w:rPr/>
+              <w:t> </w:t>
+            </w:r>
+          </w:p>
+        </w:tc>
+        <w:tc>
+          <w:tcPr>
+            <w:tcW w:w="830" w:type="dxa"/>
+            <w:tcBorders>
+              <w:left w:val="double" w:sz="2" w:space="0" w:color="808080"/>
+              <w:bottom w:val="double" w:sz="2" w:space="0" w:color="808080"/>
+              <w:right w:val="double" w:sz="2" w:space="0" w:color="808080"/>
+            </w:tcBorders>
+            <w:vAlign w:val="center"/>
+          </w:tcPr>
+          <w:p>
+            <w:pPr>
+              <w:pStyle w:val="Contedodatabela"/>
+              <w:bidi w:val="0"/>
+              <w:spacing w:before="0" w:after="283"/>
+              <w:jc w:val="left"/>
+              <w:rPr/>
+            </w:pPr>
+            <w:r>
+              <w:rPr/>
+              <w:t> </w:t>
+            </w:r>
+          </w:p>
+        </w:tc>
+        <w:tc>
+          <w:tcPr>
+            <w:tcW w:w="605" w:type="dxa"/>
+            <w:tcBorders>
+              <w:left w:val="double" w:sz="2" w:space="0" w:color="808080"/>
+              <w:bottom w:val="double" w:sz="2" w:space="0" w:color="808080"/>
+              <w:right w:val="double" w:sz="2" w:space="0" w:color="808080"/>
+            </w:tcBorders>
+            <w:vAlign w:val="center"/>
+          </w:tcPr>
+          <w:p>
+            <w:pPr>
+              <w:pStyle w:val="Contedodatabela"/>
+              <w:bidi w:val="0"/>
+              <w:spacing w:before="0" w:after="283"/>
+              <w:jc w:val="left"/>
+              <w:rPr/>
+            </w:pPr>
+            <w:r>
+              <w:rPr/>
+              <w:t> </w:t>
+            </w:r>
+          </w:p>
+        </w:tc>
+        <w:tc>
+          <w:tcPr>
+            <w:tcW w:w="605" w:type="dxa"/>
+            <w:tcBorders>
+              <w:left w:val="double" w:sz="2" w:space="0" w:color="808080"/>
+              <w:bottom w:val="double" w:sz="2" w:space="0" w:color="808080"/>
+              <w:right w:val="double" w:sz="2" w:space="0" w:color="808080"/>
+            </w:tcBorders>
+            <w:vAlign w:val="center"/>
+          </w:tcPr>
+          <w:p>
+            <w:pPr>
+              <w:pStyle w:val="Contedodatabela"/>
+              <w:bidi w:val="0"/>
+              <w:spacing w:before="0" w:after="283"/>
+              <w:jc w:val="left"/>
+              <w:rPr/>
+            </w:pPr>
+            <w:r>
+              <w:rPr/>
+              <w:t> </w:t>
+            </w:r>
+          </w:p>
+        </w:tc>
+        <w:tc>
+          <w:tcPr>
+            <w:tcW w:w="605" w:type="dxa"/>
+            <w:tcBorders>
+              <w:left w:val="double" w:sz="2" w:space="0" w:color="808080"/>
+              <w:bottom w:val="double" w:sz="2" w:space="0" w:color="808080"/>
+              <w:right w:val="double" w:sz="2" w:space="0" w:color="808080"/>
+            </w:tcBorders>
+            <w:vAlign w:val="center"/>
+          </w:tcPr>
+          <w:p>
+            <w:pPr>
+              <w:pStyle w:val="Contedodatabela"/>
+              <w:bidi w:val="0"/>
+              <w:spacing w:before="0" w:after="283"/>
+              <w:jc w:val="left"/>
+              <w:rPr/>
+            </w:pPr>
+            <w:r>
+              <w:rPr/>
+              <w:t> </w:t>
+            </w:r>
+          </w:p>
+        </w:tc>
+        <w:tc>
+          <w:tcPr>
+            <w:tcW w:w="1175" w:type="dxa"/>
             <w:tcBorders>
               <w:left w:val="double" w:sz="2" w:space="0" w:color="808080"/>
               <w:bottom w:val="double" w:sz="2" w:space="0" w:color="808080"/>

</xml_diff>